<commit_message>
docs: sync defense guide with current features
</commit_message>
<xml_diff>
--- a/docs/答辩用_系统功能源码链路讲解.docx
+++ b/docs/答辩用_系统功能源码链路讲解.docx
@@ -13950,7 +13950,7 @@
         <w:pStyle w:val="Heading1"/>
       </w:pPr>
       <w:r>
-        <w:t>11. 运营指挥中心</w:t>
+        <w:t>11. 日志中心和诊断</w:t>
       </w:r>
     </w:p>
     <w:p>
@@ -13977,7 +13977,7 @@
           <w:rFonts w:ascii="Consolas" w:hAnsi="Consolas" w:eastAsia="Consolas"/>
           <w:sz w:val="18"/>
         </w:rPr>
-        <w:t>web/src/views/OperationCenterView.vue</w:t>
+        <w:t>web/src/views/LogCenterView.vue</w:t>
       </w:r>
     </w:p>
     <w:p>
@@ -13996,7 +13996,7 @@
           <w:rFonts w:ascii="Consolas" w:hAnsi="Consolas" w:eastAsia="Consolas"/>
           <w:sz w:val="18"/>
         </w:rPr>
-        <w:t>web/src/api/operationApi.js</w:t>
+        <w:t>web/src/api/logApi.js</w:t>
       </w:r>
     </w:p>
     <w:p>
@@ -14015,7 +14015,7 @@
           <w:rFonts w:ascii="Consolas" w:hAnsi="Consolas" w:eastAsia="Consolas"/>
           <w:sz w:val="18"/>
         </w:rPr>
-        <w:t>OperationInsightsController</w:t>
+        <w:t>LogController</w:t>
       </w:r>
     </w:p>
     <w:p>
@@ -14034,7 +14034,7 @@
           <w:rFonts w:ascii="Consolas" w:hAnsi="Consolas" w:eastAsia="Consolas"/>
           <w:sz w:val="18"/>
         </w:rPr>
-        <w:t>OperationInsightsServiceImpl</w:t>
+        <w:t>LogServiceImpl</w:t>
       </w:r>
     </w:p>
     <w:p>
@@ -14046,14 +14046,42 @@
           <w:rFonts w:ascii="宋体" w:hAnsi="宋体" w:eastAsia="宋体"/>
           <w:sz w:val="21"/>
         </w:rPr>
-        <w:t>数据库访问：</w:t>
-      </w:r>
-      <w:r>
-        <w:rPr>
-          <w:rFonts w:ascii="Consolas" w:hAnsi="Consolas" w:eastAsia="Consolas"/>
-          <w:sz w:val="18"/>
-        </w:rPr>
-        <w:t>JdbcTemplate</w:t>
+        <w:t>Mapper XML：</w:t>
+      </w:r>
+      <w:r>
+        <w:rPr>
+          <w:rFonts w:ascii="Consolas" w:hAnsi="Consolas" w:eastAsia="Consolas"/>
+          <w:sz w:val="18"/>
+        </w:rPr>
+        <w:t>AiCallLogMapper.xml</w:t>
+      </w:r>
+      <w:r>
+        <w:rPr>
+          <w:rFonts w:ascii="宋体" w:hAnsi="宋体" w:eastAsia="宋体"/>
+          <w:sz w:val="21"/>
+        </w:rPr>
+        <w:t>、</w:t>
+      </w:r>
+      <w:r>
+        <w:rPr>
+          <w:rFonts w:ascii="Consolas" w:hAnsi="Consolas" w:eastAsia="Consolas"/>
+          <w:sz w:val="18"/>
+        </w:rPr>
+        <w:t>RetrievalLogMapper.xml</w:t>
+      </w:r>
+      <w:r>
+        <w:rPr>
+          <w:rFonts w:ascii="宋体" w:hAnsi="宋体" w:eastAsia="宋体"/>
+          <w:sz w:val="21"/>
+        </w:rPr>
+        <w:t>、</w:t>
+      </w:r>
+      <w:r>
+        <w:rPr>
+          <w:rFonts w:ascii="Consolas" w:hAnsi="Consolas" w:eastAsia="Consolas"/>
+          <w:sz w:val="18"/>
+        </w:rPr>
+        <w:t>ProcessTraceMapper.xml</w:t>
       </w:r>
     </w:p>
     <w:p>
@@ -14065,14 +14093,14 @@
           <w:rFonts w:ascii="宋体" w:hAnsi="宋体" w:eastAsia="宋体"/>
           <w:sz w:val="21"/>
         </w:rPr>
-        <w:t>数据表：</w:t>
-      </w:r>
-      <w:r>
-        <w:rPr>
-          <w:rFonts w:ascii="Consolas" w:hAnsi="Consolas" w:eastAsia="Consolas"/>
-          <w:sz w:val="18"/>
-        </w:rPr>
-        <w:t>chat_session</w:t>
+        <w:t>数据库表：</w:t>
+      </w:r>
+      <w:r>
+        <w:rPr>
+          <w:rFonts w:ascii="Consolas" w:hAnsi="Consolas" w:eastAsia="Consolas"/>
+          <w:sz w:val="18"/>
+        </w:rPr>
+        <w:t>ai_call_log</w:t>
       </w:r>
       <w:r>
         <w:rPr>
@@ -14086,7 +14114,7 @@
           <w:rFonts w:ascii="Consolas" w:hAnsi="Consolas" w:eastAsia="Consolas"/>
           <w:sz w:val="18"/>
         </w:rPr>
-        <w:t>service_ticket</w:t>
+        <w:t>retrieval_log</w:t>
       </w:r>
       <w:r>
         <w:rPr>
@@ -14100,49 +14128,7 @@
           <w:rFonts w:ascii="Consolas" w:hAnsi="Consolas" w:eastAsia="Consolas"/>
           <w:sz w:val="18"/>
         </w:rPr>
-        <w:t>retrieval_log</w:t>
-      </w:r>
-      <w:r>
-        <w:rPr>
-          <w:rFonts w:ascii="宋体" w:hAnsi="宋体" w:eastAsia="宋体"/>
-          <w:sz w:val="21"/>
-        </w:rPr>
-        <w:t>、</w:t>
-      </w:r>
-      <w:r>
-        <w:rPr>
-          <w:rFonts w:ascii="Consolas" w:hAnsi="Consolas" w:eastAsia="Consolas"/>
-          <w:sz w:val="18"/>
-        </w:rPr>
-        <w:t>ai_call_log</w:t>
-      </w:r>
-      <w:r>
-        <w:rPr>
-          <w:rFonts w:ascii="宋体" w:hAnsi="宋体" w:eastAsia="宋体"/>
-          <w:sz w:val="21"/>
-        </w:rPr>
-        <w:t>、</w:t>
-      </w:r>
-      <w:r>
-        <w:rPr>
-          <w:rFonts w:ascii="Consolas" w:hAnsi="Consolas" w:eastAsia="Consolas"/>
-          <w:sz w:val="18"/>
-        </w:rPr>
-        <w:t>intent_record</w:t>
-      </w:r>
-      <w:r>
-        <w:rPr>
-          <w:rFonts w:ascii="宋体" w:hAnsi="宋体" w:eastAsia="宋体"/>
-          <w:sz w:val="21"/>
-        </w:rPr>
-        <w:t>、</w:t>
-      </w:r>
-      <w:r>
-        <w:rPr>
-          <w:rFonts w:ascii="Consolas" w:hAnsi="Consolas" w:eastAsia="Consolas"/>
-          <w:sz w:val="18"/>
-        </w:rPr>
-        <w:t>demo_order</w:t>
+        <w:t>process_trace</w:t>
       </w:r>
     </w:p>
     <w:p>
@@ -14163,35 +14149,7 @@
           <w:rFonts w:ascii="宋体" w:hAnsi="宋体" w:eastAsia="宋体"/>
           <w:sz w:val="21"/>
         </w:rPr>
-        <w:t xml:space="preserve">前端页面定义 </w:t>
-      </w:r>
-      <w:r>
-        <w:rPr>
-          <w:rFonts w:ascii="Consolas" w:hAnsi="Consolas" w:eastAsia="Consolas"/>
-          <w:sz w:val="18"/>
-        </w:rPr>
-        <w:t>insights = reactive({...})</w:t>
-      </w:r>
-      <w:r>
-        <w:rPr>
-          <w:rFonts w:ascii="宋体" w:hAnsi="宋体" w:eastAsia="宋体"/>
-          <w:sz w:val="21"/>
-        </w:rPr>
-        <w:t xml:space="preserve"> 保存运营数据，进入页面执行 </w:t>
-      </w:r>
-      <w:r>
-        <w:rPr>
-          <w:rFonts w:ascii="Consolas" w:hAnsi="Consolas" w:eastAsia="Consolas"/>
-          <w:sz w:val="18"/>
-        </w:rPr>
-        <w:t>loadInsights()</w:t>
-      </w:r>
-      <w:r>
-        <w:rPr>
-          <w:rFonts w:ascii="宋体" w:hAnsi="宋体" w:eastAsia="宋体"/>
-          <w:sz w:val="21"/>
-        </w:rPr>
-        <w:t>：</w:t>
+        <w:t>前端日志中心有三个主要部分：</w:t>
       </w:r>
     </w:p>
     <w:p>
@@ -14204,7 +14162,39 @@
           <w:rFonts w:ascii="Consolas" w:hAnsi="Consolas" w:eastAsia="Consolas"/>
           <w:sz w:val="18"/>
         </w:rPr>
-        <w:t>GET /operation-insights</w:t>
+        <w:t>activeTab = ref('ai')</w:t>
+        <w:br/>
+      </w:r>
+      <w:r>
+        <w:rPr>
+          <w:rFonts w:ascii="Consolas" w:hAnsi="Consolas" w:eastAsia="Consolas"/>
+          <w:sz w:val="18"/>
+        </w:rPr>
+        <w:t>aiQuery = reactive({ page: 1, pageSize: 50, status: '' })</w:t>
+        <w:br/>
+      </w:r>
+      <w:r>
+        <w:rPr>
+          <w:rFonts w:ascii="Consolas" w:hAnsi="Consolas" w:eastAsia="Consolas"/>
+          <w:sz w:val="18"/>
+        </w:rPr>
+        <w:t>retrievalQuery = reactive({ page: 1, pageSize: 50, keyword: '' })</w:t>
+        <w:br/>
+      </w:r>
+      <w:r>
+        <w:rPr>
+          <w:rFonts w:ascii="Consolas" w:hAnsi="Consolas" w:eastAsia="Consolas"/>
+          <w:sz w:val="18"/>
+        </w:rPr>
+        <w:t>diagnostics = ref(null)</w:t>
+        <w:br/>
+      </w:r>
+      <w:r>
+        <w:rPr>
+          <w:rFonts w:ascii="Consolas" w:hAnsi="Consolas" w:eastAsia="Consolas"/>
+          <w:sz w:val="18"/>
+        </w:rPr>
+        <w:t>traces = ref([])</w:t>
       </w:r>
     </w:p>
     <w:p>
@@ -14217,35 +14207,92 @@
           <w:rFonts w:ascii="宋体" w:hAnsi="宋体" w:eastAsia="宋体"/>
           <w:sz w:val="21"/>
         </w:rPr>
-        <w:t xml:space="preserve">后端 </w:t>
-      </w:r>
-      <w:r>
-        <w:rPr>
-          <w:rFonts w:ascii="Consolas" w:hAnsi="Consolas" w:eastAsia="Consolas"/>
-          <w:sz w:val="18"/>
-        </w:rPr>
-        <w:t>OperationInsightsServiceImpl.getInsights()</w:t>
-      </w:r>
-      <w:r>
-        <w:rPr>
-          <w:rFonts w:ascii="宋体" w:hAnsi="宋体" w:eastAsia="宋体"/>
-          <w:sz w:val="21"/>
-        </w:rPr>
-        <w:t xml:space="preserve"> 用 </w:t>
-      </w:r>
-      <w:r>
-        <w:rPr>
-          <w:rFonts w:ascii="Consolas" w:hAnsi="Consolas" w:eastAsia="Consolas"/>
-          <w:sz w:val="18"/>
-        </w:rPr>
-        <w:t>JdbcTemplate</w:t>
-      </w:r>
-      <w:r>
-        <w:rPr>
-          <w:rFonts w:ascii="宋体" w:hAnsi="宋体" w:eastAsia="宋体"/>
-          <w:sz w:val="21"/>
-        </w:rPr>
-        <w:t xml:space="preserve"> 直接执行统计 SQL，生成：</w:t>
+        <w:t>接口包括：</w:t>
+      </w:r>
+    </w:p>
+    <w:p>
+      <w:pPr>
+        <w:spacing w:before="80" w:after="120"/>
+        <w:shd w:fill="F3F6FA"/>
+      </w:pPr>
+      <w:r>
+        <w:rPr>
+          <w:rFonts w:ascii="Consolas" w:hAnsi="Consolas" w:eastAsia="Consolas"/>
+          <w:sz w:val="18"/>
+        </w:rPr>
+        <w:t>GET /ai-call-logs</w:t>
+        <w:br/>
+      </w:r>
+      <w:r>
+        <w:rPr>
+          <w:rFonts w:ascii="Consolas" w:hAnsi="Consolas" w:eastAsia="Consolas"/>
+          <w:sz w:val="18"/>
+        </w:rPr>
+        <w:t>GET /retrieval-logs</w:t>
+        <w:br/>
+      </w:r>
+      <w:r>
+        <w:rPr>
+          <w:rFonts w:ascii="Consolas" w:hAnsi="Consolas" w:eastAsia="Consolas"/>
+          <w:sz w:val="18"/>
+        </w:rPr>
+        <w:t>GET /log-diagnostics</w:t>
+        <w:br/>
+      </w:r>
+      <w:r>
+        <w:rPr>
+          <w:rFonts w:ascii="Consolas" w:hAnsi="Consolas" w:eastAsia="Consolas"/>
+          <w:sz w:val="18"/>
+        </w:rPr>
+        <w:t>GET /chat-sessions/{id}/process-traces</w:t>
+      </w:r>
+    </w:p>
+    <w:p>
+      <w:pPr>
+        <w:spacing w:line="300" w:lineRule="auto"/>
+        <w:ind w:firstLine="420"/>
+      </w:pPr>
+      <w:r>
+        <w:rPr>
+          <w:rFonts w:ascii="Consolas" w:hAnsi="Consolas" w:eastAsia="Consolas"/>
+          <w:sz w:val="18"/>
+        </w:rPr>
+        <w:t>LogServiceImpl.pageAiLogs</w:t>
+      </w:r>
+      <w:r>
+        <w:rPr>
+          <w:rFonts w:ascii="宋体" w:hAnsi="宋体" w:eastAsia="宋体"/>
+          <w:sz w:val="21"/>
+        </w:rPr>
+        <w:t xml:space="preserve"> 和 </w:t>
+      </w:r>
+      <w:r>
+        <w:rPr>
+          <w:rFonts w:ascii="Consolas" w:hAnsi="Consolas" w:eastAsia="Consolas"/>
+          <w:sz w:val="18"/>
+        </w:rPr>
+        <w:t>pageRetrievalLogs</w:t>
+      </w:r>
+      <w:r>
+        <w:rPr>
+          <w:rFonts w:ascii="宋体" w:hAnsi="宋体" w:eastAsia="宋体"/>
+          <w:sz w:val="21"/>
+        </w:rPr>
+        <w:t xml:space="preserve"> 都用 PageHelper 分页。</w:t>
+      </w:r>
+      <w:r>
+        <w:rPr>
+          <w:rFonts w:ascii="Consolas" w:hAnsi="Consolas" w:eastAsia="Consolas"/>
+          <w:sz w:val="18"/>
+        </w:rPr>
+        <w:t>getDiagnostics</w:t>
+      </w:r>
+      <w:r>
+        <w:rPr>
+          <w:rFonts w:ascii="宋体" w:hAnsi="宋体" w:eastAsia="宋体"/>
+          <w:sz w:val="21"/>
+        </w:rPr>
+        <w:t xml:space="preserve"> 会取最近 AI 日志、知识检索日志和处理轨迹，计算：</w:t>
       </w:r>
     </w:p>
     <w:p>
@@ -14257,7 +14304,7 @@
           <w:rFonts w:ascii="宋体" w:hAnsi="宋体" w:eastAsia="宋体"/>
           <w:sz w:val="21"/>
         </w:rPr>
-        <w:t>首屏指标：会话数、待处理工单数、知识命中次数、AI 成功率、人工闭环量。</w:t>
+        <w:t>AI 成功数、失败数、跳过数。</w:t>
       </w:r>
     </w:p>
     <w:p>
@@ -14269,7 +14316,7 @@
           <w:rFonts w:ascii="宋体" w:hAnsi="宋体" w:eastAsia="宋体"/>
           <w:sz w:val="21"/>
         </w:rPr>
-        <w:t>新增功能卡片。</w:t>
+        <w:t>token 数和平均耗时。</w:t>
       </w:r>
     </w:p>
     <w:p>
@@ -14281,7 +14328,7 @@
           <w:rFonts w:ascii="宋体" w:hAnsi="宋体" w:eastAsia="宋体"/>
           <w:sz w:val="21"/>
         </w:rPr>
-        <w:t>意图热力分析。</w:t>
+        <w:t>最近成功率趋势。</w:t>
       </w:r>
     </w:p>
     <w:p>
@@ -14293,7 +14340,7 @@
           <w:rFonts w:ascii="宋体" w:hAnsi="宋体" w:eastAsia="宋体"/>
           <w:sz w:val="21"/>
         </w:rPr>
-        <w:t>工单 SLA 风险。</w:t>
+        <w:t>主要模型。</w:t>
       </w:r>
     </w:p>
     <w:p>
@@ -14305,7 +14352,7 @@
           <w:rFonts w:ascii="宋体" w:hAnsi="宋体" w:eastAsia="宋体"/>
           <w:sz w:val="21"/>
         </w:rPr>
-        <w:t>多渠道会话分布。</w:t>
+        <w:t>失败入口。</w:t>
       </w:r>
     </w:p>
     <w:p>
@@ -14317,7 +14364,7 @@
           <w:rFonts w:ascii="宋体" w:hAnsi="宋体" w:eastAsia="宋体"/>
           <w:sz w:val="21"/>
         </w:rPr>
-        <w:t>知识命中 Top 榜。</w:t>
+        <w:t>知识命中文档数和 Top 文档。</w:t>
       </w:r>
     </w:p>
     <w:p>
@@ -14329,7 +14376,7 @@
           <w:rFonts w:ascii="宋体" w:hAnsi="宋体" w:eastAsia="宋体"/>
           <w:sz w:val="21"/>
         </w:rPr>
-        <w:t>订单风险扫描。</w:t>
+        <w:t>最新会话处理轨迹进度。</w:t>
       </w:r>
     </w:p>
     <w:p>
@@ -14341,31 +14388,7 @@
           <w:rFonts w:ascii="宋体" w:hAnsi="宋体" w:eastAsia="宋体"/>
           <w:sz w:val="21"/>
         </w:rPr>
-        <w:t>AI 运行质量摘要。</w:t>
-      </w:r>
-    </w:p>
-    <w:p>
-      <w:pPr>
-        <w:pStyle w:val="ListBullet"/>
-      </w:pPr>
-      <w:r>
-        <w:rPr>
-          <w:rFonts w:ascii="宋体" w:hAnsi="宋体" w:eastAsia="宋体"/>
-          <w:sz w:val="21"/>
-        </w:rPr>
-        <w:t>下一步动作清单。</w:t>
-      </w:r>
-    </w:p>
-    <w:p>
-      <w:pPr>
-        <w:pStyle w:val="ListBullet"/>
-      </w:pPr>
-      <w:r>
-        <w:rPr>
-          <w:rFonts w:ascii="宋体" w:hAnsi="宋体" w:eastAsia="宋体"/>
-          <w:sz w:val="21"/>
-        </w:rPr>
-        <w:t>版本里程碑。</w:t>
+        <w:t>风险信号和建议动作。</w:t>
       </w:r>
     </w:p>
     <w:p>
@@ -14387,49 +14410,49 @@
           <w:rFonts w:ascii="宋体" w:hAnsi="宋体" w:eastAsia="宋体"/>
           <w:sz w:val="21"/>
         </w:rPr>
-        <w:t xml:space="preserve">运营指挥中心是把系统里的真实运行数据聚合成一个管理看板。前端只调 </w:t>
-      </w:r>
-      <w:r>
-        <w:rPr>
-          <w:rFonts w:ascii="Consolas" w:hAnsi="Consolas" w:eastAsia="Consolas"/>
-          <w:sz w:val="18"/>
-        </w:rPr>
-        <w:t>/operation-insights</w:t>
-      </w:r>
-      <w:r>
-        <w:rPr>
-          <w:rFonts w:ascii="宋体" w:hAnsi="宋体" w:eastAsia="宋体"/>
-          <w:sz w:val="21"/>
-        </w:rPr>
-        <w:t xml:space="preserve">。后端没有简单查一张表，而是用 </w:t>
-      </w:r>
-      <w:r>
-        <w:rPr>
-          <w:rFonts w:ascii="Consolas" w:hAnsi="Consolas" w:eastAsia="Consolas"/>
-          <w:sz w:val="18"/>
-        </w:rPr>
-        <w:t>JdbcTemplate</w:t>
-      </w:r>
-      <w:r>
-        <w:rPr>
-          <w:rFonts w:ascii="宋体" w:hAnsi="宋体" w:eastAsia="宋体"/>
-          <w:sz w:val="21"/>
-        </w:rPr>
-        <w:t xml:space="preserve"> 对会话表、工单表、知识检索日志、AI 调用日志、意图记录、订单表做统计。统计结果组装成 </w:t>
-      </w:r>
-      <w:r>
-        <w:rPr>
-          <w:rFonts w:ascii="Consolas" w:hAnsi="Consolas" w:eastAsia="Consolas"/>
-          <w:sz w:val="18"/>
-        </w:rPr>
-        <w:t>OperationInsights</w:t>
-      </w:r>
-      <w:r>
-        <w:rPr>
-          <w:rFonts w:ascii="宋体" w:hAnsi="宋体" w:eastAsia="宋体"/>
-          <w:sz w:val="21"/>
-        </w:rPr>
-        <w:t>，前端把不同字段展示成指标卡、榜单、风险队列和行动建议。</w:t>
+        <w:t xml:space="preserve">日志中心是为了证明 AI 和 RAG 链路可追踪。聊天每次生成回复时，后端都会写 </w:t>
+      </w:r>
+      <w:r>
+        <w:rPr>
+          <w:rFonts w:ascii="Consolas" w:hAnsi="Consolas" w:eastAsia="Consolas"/>
+          <w:sz w:val="18"/>
+        </w:rPr>
+        <w:t>ai_call_log</w:t>
+      </w:r>
+      <w:r>
+        <w:rPr>
+          <w:rFonts w:ascii="宋体" w:hAnsi="宋体" w:eastAsia="宋体"/>
+          <w:sz w:val="21"/>
+        </w:rPr>
+        <w:t>、</w:t>
+      </w:r>
+      <w:r>
+        <w:rPr>
+          <w:rFonts w:ascii="Consolas" w:hAnsi="Consolas" w:eastAsia="Consolas"/>
+          <w:sz w:val="18"/>
+        </w:rPr>
+        <w:t>retrieval_log</w:t>
+      </w:r>
+      <w:r>
+        <w:rPr>
+          <w:rFonts w:ascii="宋体" w:hAnsi="宋体" w:eastAsia="宋体"/>
+          <w:sz w:val="21"/>
+        </w:rPr>
+        <w:t xml:space="preserve"> 和 </w:t>
+      </w:r>
+      <w:r>
+        <w:rPr>
+          <w:rFonts w:ascii="Consolas" w:hAnsi="Consolas" w:eastAsia="Consolas"/>
+          <w:sz w:val="18"/>
+        </w:rPr>
+        <w:t>process_trace</w:t>
+      </w:r>
+      <w:r>
+        <w:rPr>
+          <w:rFonts w:ascii="宋体" w:hAnsi="宋体" w:eastAsia="宋体"/>
+          <w:sz w:val="21"/>
+        </w:rPr>
+        <w:t>。日志页面分别请求 AI 调用日志、知识命中日志和诊断接口。Service 会根据最近日志统计成功率、失败数、平均耗时、知识命中文档和轨迹进度。这样老师如果问 AI 有没有真的调用、知识库有没有命中，我可以直接打开日志中心给他看证据。</w:t>
       </w:r>
     </w:p>
     <w:p>
@@ -14437,7 +14460,7 @@
         <w:pStyle w:val="Heading1"/>
       </w:pPr>
       <w:r>
-        <w:t>12. 特色闭环中心</w:t>
+        <w:t>12. AI 测试页和模型状态</w:t>
       </w:r>
     </w:p>
     <w:p>
@@ -14464,7 +14487,7 @@
           <w:rFonts w:ascii="Consolas" w:hAnsi="Consolas" w:eastAsia="Consolas"/>
           <w:sz w:val="18"/>
         </w:rPr>
-        <w:t>web/src/views/FeatureClosureView.vue</w:t>
+        <w:t>web/src/views/AiTestView.vue</w:t>
       </w:r>
     </w:p>
     <w:p>
@@ -14483,7 +14506,21 @@
           <w:rFonts w:ascii="Consolas" w:hAnsi="Consolas" w:eastAsia="Consolas"/>
           <w:sz w:val="18"/>
         </w:rPr>
-        <w:t>getFeatureClosures</w:t>
+        <w:t>web/src/api/aiApi.js</w:t>
+      </w:r>
+      <w:r>
+        <w:rPr>
+          <w:rFonts w:ascii="宋体" w:hAnsi="宋体" w:eastAsia="宋体"/>
+          <w:sz w:val="21"/>
+        </w:rPr>
+        <w:t>、</w:t>
+      </w:r>
+      <w:r>
+        <w:rPr>
+          <w:rFonts w:ascii="Consolas" w:hAnsi="Consolas" w:eastAsia="Consolas"/>
+          <w:sz w:val="18"/>
+        </w:rPr>
+        <w:t>web/src/api/systemApi.js</w:t>
       </w:r>
     </w:p>
     <w:p>
@@ -14502,7 +14539,21 @@
           <w:rFonts w:ascii="Consolas" w:hAnsi="Consolas" w:eastAsia="Consolas"/>
           <w:sz w:val="18"/>
         </w:rPr>
-        <w:t>FeatureClosureController</w:t>
+        <w:t>AiTestController</w:t>
+      </w:r>
+      <w:r>
+        <w:rPr>
+          <w:rFonts w:ascii="宋体" w:hAnsi="宋体" w:eastAsia="宋体"/>
+          <w:sz w:val="21"/>
+        </w:rPr>
+        <w:t>、</w:t>
+      </w:r>
+      <w:r>
+        <w:rPr>
+          <w:rFonts w:ascii="Consolas" w:hAnsi="Consolas" w:eastAsia="Consolas"/>
+          <w:sz w:val="18"/>
+        </w:rPr>
+        <w:t>SystemController</w:t>
       </w:r>
     </w:p>
     <w:p>
@@ -14521,7 +14572,26 @@
           <w:rFonts w:ascii="Consolas" w:hAnsi="Consolas" w:eastAsia="Consolas"/>
           <w:sz w:val="18"/>
         </w:rPr>
-        <w:t>FeatureClosureServiceImpl</w:t>
+        <w:t>AiServiceImpl</w:t>
+      </w:r>
+    </w:p>
+    <w:p>
+      <w:pPr>
+        <w:pStyle w:val="ListBullet"/>
+      </w:pPr>
+      <w:r>
+        <w:rPr>
+          <w:rFonts w:ascii="宋体" w:hAnsi="宋体" w:eastAsia="宋体"/>
+          <w:sz w:val="21"/>
+        </w:rPr>
+        <w:t>数据库表：</w:t>
+      </w:r>
+      <w:r>
+        <w:rPr>
+          <w:rFonts w:ascii="Consolas" w:hAnsi="Consolas" w:eastAsia="Consolas"/>
+          <w:sz w:val="18"/>
+        </w:rPr>
+        <w:t>ai_call_log</w:t>
       </w:r>
     </w:p>
     <w:p>
@@ -14542,21 +14612,7 @@
           <w:rFonts w:ascii="宋体" w:hAnsi="宋体" w:eastAsia="宋体"/>
           <w:sz w:val="21"/>
         </w:rPr>
-        <w:t xml:space="preserve">前端定义 </w:t>
-      </w:r>
-      <w:r>
-        <w:rPr>
-          <w:rFonts w:ascii="Consolas" w:hAnsi="Consolas" w:eastAsia="Consolas"/>
-          <w:sz w:val="18"/>
-        </w:rPr>
-        <w:t>dashboard = reactive({...})</w:t>
-      </w:r>
-      <w:r>
-        <w:rPr>
-          <w:rFonts w:ascii="宋体" w:hAnsi="宋体" w:eastAsia="宋体"/>
-          <w:sz w:val="21"/>
-        </w:rPr>
-        <w:t>，页面加载时调用：</w:t>
+        <w:t>AI 测试页有一个 prompt 输入框：</w:t>
       </w:r>
     </w:p>
     <w:p>
@@ -14569,7 +14625,23 @@
           <w:rFonts w:ascii="Consolas" w:hAnsi="Consolas" w:eastAsia="Consolas"/>
           <w:sz w:val="18"/>
         </w:rPr>
-        <w:t>GET /feature-closures</w:t>
+        <w:t>prompt = ref('请回复：后端已经通过 sub2api 调用真实模型。')</w:t>
+        <w:br/>
+      </w:r>
+      <w:r>
+        <w:rPr>
+          <w:rFonts w:ascii="Consolas" w:hAnsi="Consolas" w:eastAsia="Consolas"/>
+          <w:sz w:val="18"/>
+        </w:rPr>
+        <w:t>result = ref(null)</w:t>
+        <w:br/>
+      </w:r>
+      <w:r>
+        <w:rPr>
+          <w:rFonts w:ascii="Consolas" w:hAnsi="Consolas" w:eastAsia="Consolas"/>
+          <w:sz w:val="18"/>
+        </w:rPr>
+        <w:t>loading = ref(false)</w:t>
       </w:r>
     </w:p>
     <w:p>
@@ -14582,7 +14654,20 @@
           <w:rFonts w:ascii="宋体" w:hAnsi="宋体" w:eastAsia="宋体"/>
           <w:sz w:val="21"/>
         </w:rPr>
-        <w:t>后端 Service 生成特色功能闭环仪表盘。它会把每个亮点功能对应的能力、状态、信号、诊断、下一步动作、页面路由、接口、证据和参考来源整理出来。</w:t>
+        <w:t>点击测试调用：</w:t>
+      </w:r>
+    </w:p>
+    <w:p>
+      <w:pPr>
+        <w:spacing w:before="80" w:after="120"/>
+        <w:shd w:fill="F3F6FA"/>
+      </w:pPr>
+      <w:r>
+        <w:rPr>
+          <w:rFonts w:ascii="Consolas" w:hAnsi="Consolas" w:eastAsia="Consolas"/>
+          <w:sz w:val="18"/>
+        </w:rPr>
+        <w:t>POST /ai-tests</w:t>
       </w:r>
     </w:p>
     <w:p>
@@ -14595,7 +14680,140 @@
           <w:rFonts w:ascii="宋体" w:hAnsi="宋体" w:eastAsia="宋体"/>
           <w:sz w:val="21"/>
         </w:rPr>
-        <w:t>这个页面是答辩展示用的，它让老师可以看到项目不是只有聊天框，而是有订单、售后、工单、知识、AI、日志、运营和验证闭环。</w:t>
+        <w:t xml:space="preserve">后端 </w:t>
+      </w:r>
+      <w:r>
+        <w:rPr>
+          <w:rFonts w:ascii="Consolas" w:hAnsi="Consolas" w:eastAsia="Consolas"/>
+          <w:sz w:val="18"/>
+        </w:rPr>
+        <w:t>AiTestController.test</w:t>
+      </w:r>
+      <w:r>
+        <w:rPr>
+          <w:rFonts w:ascii="宋体" w:hAnsi="宋体" w:eastAsia="宋体"/>
+          <w:sz w:val="21"/>
+        </w:rPr>
+        <w:t xml:space="preserve"> 调用 </w:t>
+      </w:r>
+      <w:r>
+        <w:rPr>
+          <w:rFonts w:ascii="Consolas" w:hAnsi="Consolas" w:eastAsia="Consolas"/>
+          <w:sz w:val="18"/>
+        </w:rPr>
+        <w:t>aiService.test(prompt)</w:t>
+      </w:r>
+      <w:r>
+        <w:rPr>
+          <w:rFonts w:ascii="宋体" w:hAnsi="宋体" w:eastAsia="宋体"/>
+          <w:sz w:val="21"/>
+        </w:rPr>
+        <w:t>。</w:t>
+      </w:r>
+      <w:r>
+        <w:rPr>
+          <w:rFonts w:ascii="Consolas" w:hAnsi="Consolas" w:eastAsia="Consolas"/>
+          <w:sz w:val="18"/>
+        </w:rPr>
+        <w:t>AiServiceImpl</w:t>
+      </w:r>
+      <w:r>
+        <w:rPr>
+          <w:rFonts w:ascii="宋体" w:hAnsi="宋体" w:eastAsia="宋体"/>
+          <w:sz w:val="21"/>
+        </w:rPr>
+        <w:t xml:space="preserve"> 负责根据配置调用模型。如果 AI 没启用或调用失败，Service 会返回失败状态或兜底信息，而不是让系统崩掉。</w:t>
+      </w:r>
+    </w:p>
+    <w:p>
+      <w:pPr>
+        <w:spacing w:line="300" w:lineRule="auto"/>
+        <w:ind w:firstLine="420"/>
+      </w:pPr>
+      <w:r>
+        <w:rPr>
+          <w:rFonts w:ascii="宋体" w:hAnsi="宋体" w:eastAsia="宋体"/>
+          <w:sz w:val="21"/>
+        </w:rPr>
+        <w:t xml:space="preserve">系统模型状态相关接口在 </w:t>
+      </w:r>
+      <w:r>
+        <w:rPr>
+          <w:rFonts w:ascii="Consolas" w:hAnsi="Consolas" w:eastAsia="Consolas"/>
+          <w:sz w:val="18"/>
+        </w:rPr>
+        <w:t>SystemController</w:t>
+      </w:r>
+      <w:r>
+        <w:rPr>
+          <w:rFonts w:ascii="宋体" w:hAnsi="宋体" w:eastAsia="宋体"/>
+          <w:sz w:val="21"/>
+        </w:rPr>
+        <w:t>：</w:t>
+      </w:r>
+    </w:p>
+    <w:p>
+      <w:pPr>
+        <w:spacing w:before="80" w:after="120"/>
+        <w:shd w:fill="F3F6FA"/>
+      </w:pPr>
+      <w:r>
+        <w:rPr>
+          <w:rFonts w:ascii="Consolas" w:hAnsi="Consolas" w:eastAsia="Consolas"/>
+          <w:sz w:val="18"/>
+        </w:rPr>
+        <w:t>GET /system/status</w:t>
+        <w:br/>
+      </w:r>
+      <w:r>
+        <w:rPr>
+          <w:rFonts w:ascii="Consolas" w:hAnsi="Consolas" w:eastAsia="Consolas"/>
+          <w:sz w:val="18"/>
+        </w:rPr>
+        <w:t>GET /system/ai-models</w:t>
+        <w:br/>
+      </w:r>
+      <w:r>
+        <w:rPr>
+          <w:rFonts w:ascii="Consolas" w:hAnsi="Consolas" w:eastAsia="Consolas"/>
+          <w:sz w:val="18"/>
+        </w:rPr>
+        <w:t>PUT /system/ai-models/current</w:t>
+        <w:br/>
+      </w:r>
+      <w:r>
+        <w:rPr>
+          <w:rFonts w:ascii="Consolas" w:hAnsi="Consolas" w:eastAsia="Consolas"/>
+          <w:sz w:val="18"/>
+        </w:rPr>
+        <w:t>GET /system/enums</w:t>
+      </w:r>
+    </w:p>
+    <w:p>
+      <w:pPr>
+        <w:spacing w:line="300" w:lineRule="auto"/>
+        <w:ind w:firstLine="420"/>
+      </w:pPr>
+      <w:r>
+        <w:rPr>
+          <w:rFonts w:ascii="宋体" w:hAnsi="宋体" w:eastAsia="宋体"/>
+          <w:sz w:val="21"/>
+        </w:rPr>
+        <w:t xml:space="preserve">前端聊天页也可以切换当前模型，调用 </w:t>
+      </w:r>
+      <w:r>
+        <w:rPr>
+          <w:rFonts w:ascii="Consolas" w:hAnsi="Consolas" w:eastAsia="Consolas"/>
+          <w:sz w:val="18"/>
+        </w:rPr>
+        <w:t>switchAiModel(modelName)</w:t>
+      </w:r>
+      <w:r>
+        <w:rPr>
+          <w:rFonts w:ascii="宋体" w:hAnsi="宋体" w:eastAsia="宋体"/>
+          <w:sz w:val="21"/>
+        </w:rPr>
+        <w:t>。</w:t>
       </w:r>
     </w:p>
     <w:p>
@@ -14617,14 +14835,14 @@
           <w:rFonts w:ascii="宋体" w:hAnsi="宋体" w:eastAsia="宋体"/>
           <w:sz w:val="21"/>
         </w:rPr>
-        <w:t xml:space="preserve">特色闭环中心是我为了答辩展示做的功能索引。前端请求 </w:t>
-      </w:r>
-      <w:r>
-        <w:rPr>
-          <w:rFonts w:ascii="Consolas" w:hAnsi="Consolas" w:eastAsia="Consolas"/>
-          <w:sz w:val="18"/>
-        </w:rPr>
-        <w:t>/feature-closures</w:t>
+        <w:t xml:space="preserve">AI 测试页是为了单独验证模型链路。前端把 prompt 发到 </w:t>
+      </w:r>
+      <w:r>
+        <w:rPr>
+          <w:rFonts w:ascii="Consolas" w:hAnsi="Consolas" w:eastAsia="Consolas"/>
+          <w:sz w:val="18"/>
+        </w:rPr>
+        <w:t>/ai-tests</w:t>
       </w:r>
       <w:r>
         <w:rPr>
@@ -14638,14 +14856,42 @@
           <w:rFonts w:ascii="Consolas" w:hAnsi="Consolas" w:eastAsia="Consolas"/>
           <w:sz w:val="18"/>
         </w:rPr>
-        <w:t>FeatureClosureServiceImpl</w:t>
-      </w:r>
-      <w:r>
-        <w:rPr>
-          <w:rFonts w:ascii="宋体" w:hAnsi="宋体" w:eastAsia="宋体"/>
-          <w:sz w:val="21"/>
-        </w:rPr>
-        <w:t xml:space="preserve"> 把每个特色功能的入口、接口、证据和验收方式都整理成结构化数据。页面展示这些闭环，老师问某个亮点时，我可以从这里跳到对应页面或接口去演示。</w:t>
+        <w:t>AiTestController</w:t>
+      </w:r>
+      <w:r>
+        <w:rPr>
+          <w:rFonts w:ascii="宋体" w:hAnsi="宋体" w:eastAsia="宋体"/>
+          <w:sz w:val="21"/>
+        </w:rPr>
+        <w:t xml:space="preserve"> 调 </w:t>
+      </w:r>
+      <w:r>
+        <w:rPr>
+          <w:rFonts w:ascii="Consolas" w:hAnsi="Consolas" w:eastAsia="Consolas"/>
+          <w:sz w:val="18"/>
+        </w:rPr>
+        <w:t>AiServiceImpl.test</w:t>
+      </w:r>
+      <w:r>
+        <w:rPr>
+          <w:rFonts w:ascii="宋体" w:hAnsi="宋体" w:eastAsia="宋体"/>
+          <w:sz w:val="21"/>
+        </w:rPr>
+        <w:t xml:space="preserve">。这个 Service 会返回模型提供方、模型名、状态、耗时和错误信息。即使 AI 失败，业务系统也不会崩，因为聊天和回复草稿都有本地模板兜底。模型列表和切换走 </w:t>
+      </w:r>
+      <w:r>
+        <w:rPr>
+          <w:rFonts w:ascii="Consolas" w:hAnsi="Consolas" w:eastAsia="Consolas"/>
+          <w:sz w:val="18"/>
+        </w:rPr>
+        <w:t>/system/ai-models</w:t>
+      </w:r>
+      <w:r>
+        <w:rPr>
+          <w:rFonts w:ascii="宋体" w:hAnsi="宋体" w:eastAsia="宋体"/>
+          <w:sz w:val="21"/>
+        </w:rPr>
+        <w:t>，所以模型状态也能在页面上看到。</w:t>
       </w:r>
     </w:p>
     <w:p>
@@ -14653,7 +14899,7 @@
         <w:pStyle w:val="Heading1"/>
       </w:pPr>
       <w:r>
-        <w:t>13. 日志中心和诊断</w:t>
+        <w:t>13. 系统总览和答辩展示页</w:t>
       </w:r>
     </w:p>
     <w:p>
@@ -14661,185 +14907,7 @@
         <w:pStyle w:val="Heading2"/>
       </w:pPr>
       <w:r>
-        <w:t>源码位置</w:t>
-      </w:r>
-    </w:p>
-    <w:p>
-      <w:pPr>
-        <w:pStyle w:val="ListBullet"/>
-      </w:pPr>
-      <w:r>
-        <w:rPr>
-          <w:rFonts w:ascii="宋体" w:hAnsi="宋体" w:eastAsia="宋体"/>
-          <w:sz w:val="21"/>
-        </w:rPr>
-        <w:t>前端页面：</w:t>
-      </w:r>
-      <w:r>
-        <w:rPr>
-          <w:rFonts w:ascii="Consolas" w:hAnsi="Consolas" w:eastAsia="Consolas"/>
-          <w:sz w:val="18"/>
-        </w:rPr>
-        <w:t>web/src/views/LogCenterView.vue</w:t>
-      </w:r>
-    </w:p>
-    <w:p>
-      <w:pPr>
-        <w:pStyle w:val="ListBullet"/>
-      </w:pPr>
-      <w:r>
-        <w:rPr>
-          <w:rFonts w:ascii="宋体" w:hAnsi="宋体" w:eastAsia="宋体"/>
-          <w:sz w:val="21"/>
-        </w:rPr>
-        <w:t>前端 API：</w:t>
-      </w:r>
-      <w:r>
-        <w:rPr>
-          <w:rFonts w:ascii="Consolas" w:hAnsi="Consolas" w:eastAsia="Consolas"/>
-          <w:sz w:val="18"/>
-        </w:rPr>
-        <w:t>web/src/api/logApi.js</w:t>
-      </w:r>
-    </w:p>
-    <w:p>
-      <w:pPr>
-        <w:pStyle w:val="ListBullet"/>
-      </w:pPr>
-      <w:r>
-        <w:rPr>
-          <w:rFonts w:ascii="宋体" w:hAnsi="宋体" w:eastAsia="宋体"/>
-          <w:sz w:val="21"/>
-        </w:rPr>
-        <w:t>后端 Controller：</w:t>
-      </w:r>
-      <w:r>
-        <w:rPr>
-          <w:rFonts w:ascii="Consolas" w:hAnsi="Consolas" w:eastAsia="Consolas"/>
-          <w:sz w:val="18"/>
-        </w:rPr>
-        <w:t>LogController</w:t>
-      </w:r>
-    </w:p>
-    <w:p>
-      <w:pPr>
-        <w:pStyle w:val="ListBullet"/>
-      </w:pPr>
-      <w:r>
-        <w:rPr>
-          <w:rFonts w:ascii="宋体" w:hAnsi="宋体" w:eastAsia="宋体"/>
-          <w:sz w:val="21"/>
-        </w:rPr>
-        <w:t>后端 Service：</w:t>
-      </w:r>
-      <w:r>
-        <w:rPr>
-          <w:rFonts w:ascii="Consolas" w:hAnsi="Consolas" w:eastAsia="Consolas"/>
-          <w:sz w:val="18"/>
-        </w:rPr>
-        <w:t>LogServiceImpl</w:t>
-      </w:r>
-    </w:p>
-    <w:p>
-      <w:pPr>
-        <w:pStyle w:val="ListBullet"/>
-      </w:pPr>
-      <w:r>
-        <w:rPr>
-          <w:rFonts w:ascii="宋体" w:hAnsi="宋体" w:eastAsia="宋体"/>
-          <w:sz w:val="21"/>
-        </w:rPr>
-        <w:t>Mapper XML：</w:t>
-      </w:r>
-      <w:r>
-        <w:rPr>
-          <w:rFonts w:ascii="Consolas" w:hAnsi="Consolas" w:eastAsia="Consolas"/>
-          <w:sz w:val="18"/>
-        </w:rPr>
-        <w:t>AiCallLogMapper.xml</w:t>
-      </w:r>
-      <w:r>
-        <w:rPr>
-          <w:rFonts w:ascii="宋体" w:hAnsi="宋体" w:eastAsia="宋体"/>
-          <w:sz w:val="21"/>
-        </w:rPr>
-        <w:t>、</w:t>
-      </w:r>
-      <w:r>
-        <w:rPr>
-          <w:rFonts w:ascii="Consolas" w:hAnsi="Consolas" w:eastAsia="Consolas"/>
-          <w:sz w:val="18"/>
-        </w:rPr>
-        <w:t>RetrievalLogMapper.xml</w:t>
-      </w:r>
-      <w:r>
-        <w:rPr>
-          <w:rFonts w:ascii="宋体" w:hAnsi="宋体" w:eastAsia="宋体"/>
-          <w:sz w:val="21"/>
-        </w:rPr>
-        <w:t>、</w:t>
-      </w:r>
-      <w:r>
-        <w:rPr>
-          <w:rFonts w:ascii="Consolas" w:hAnsi="Consolas" w:eastAsia="Consolas"/>
-          <w:sz w:val="18"/>
-        </w:rPr>
-        <w:t>ProcessTraceMapper.xml</w:t>
-      </w:r>
-    </w:p>
-    <w:p>
-      <w:pPr>
-        <w:pStyle w:val="ListBullet"/>
-      </w:pPr>
-      <w:r>
-        <w:rPr>
-          <w:rFonts w:ascii="宋体" w:hAnsi="宋体" w:eastAsia="宋体"/>
-          <w:sz w:val="21"/>
-        </w:rPr>
-        <w:t>数据库表：</w:t>
-      </w:r>
-      <w:r>
-        <w:rPr>
-          <w:rFonts w:ascii="Consolas" w:hAnsi="Consolas" w:eastAsia="Consolas"/>
-          <w:sz w:val="18"/>
-        </w:rPr>
-        <w:t>ai_call_log</w:t>
-      </w:r>
-      <w:r>
-        <w:rPr>
-          <w:rFonts w:ascii="宋体" w:hAnsi="宋体" w:eastAsia="宋体"/>
-          <w:sz w:val="21"/>
-        </w:rPr>
-        <w:t>、</w:t>
-      </w:r>
-      <w:r>
-        <w:rPr>
-          <w:rFonts w:ascii="Consolas" w:hAnsi="Consolas" w:eastAsia="Consolas"/>
-          <w:sz w:val="18"/>
-        </w:rPr>
-        <w:t>retrieval_log</w:t>
-      </w:r>
-      <w:r>
-        <w:rPr>
-          <w:rFonts w:ascii="宋体" w:hAnsi="宋体" w:eastAsia="宋体"/>
-          <w:sz w:val="21"/>
-        </w:rPr>
-        <w:t>、</w:t>
-      </w:r>
-      <w:r>
-        <w:rPr>
-          <w:rFonts w:ascii="Consolas" w:hAnsi="Consolas" w:eastAsia="Consolas"/>
-          <w:sz w:val="18"/>
-        </w:rPr>
-        <w:t>process_trace</w:t>
-      </w:r>
-    </w:p>
-    <w:p>
-      <w:pPr>
-        <w:pStyle w:val="Heading2"/>
-      </w:pPr>
-      <w:r>
-        <w:t>链路说明</w:t>
+        <w:t>DashboardView</w:t>
       </w:r>
     </w:p>
     <w:p>
@@ -14849,55 +14917,39 @@
       </w:pPr>
       <w:r>
         <w:rPr>
-          <w:rFonts w:ascii="宋体" w:hAnsi="宋体" w:eastAsia="宋体"/>
-          <w:sz w:val="21"/>
-        </w:rPr>
-        <w:t>前端日志中心有三个主要部分：</w:t>
-      </w:r>
-    </w:p>
-    <w:p>
-      <w:pPr>
-        <w:spacing w:before="80" w:after="120"/>
-        <w:shd w:fill="F3F6FA"/>
-      </w:pPr>
-      <w:r>
-        <w:rPr>
-          <w:rFonts w:ascii="Consolas" w:hAnsi="Consolas" w:eastAsia="Consolas"/>
-          <w:sz w:val="18"/>
-        </w:rPr>
-        <w:t>activeTab = ref('ai')</w:t>
-        <w:br/>
-      </w:r>
-      <w:r>
-        <w:rPr>
-          <w:rFonts w:ascii="Consolas" w:hAnsi="Consolas" w:eastAsia="Consolas"/>
-          <w:sz w:val="18"/>
-        </w:rPr>
-        <w:t>aiQuery = reactive({ page: 1, pageSize: 50, status: '' })</w:t>
-        <w:br/>
-      </w:r>
-      <w:r>
-        <w:rPr>
-          <w:rFonts w:ascii="Consolas" w:hAnsi="Consolas" w:eastAsia="Consolas"/>
-          <w:sz w:val="18"/>
-        </w:rPr>
-        <w:t>retrievalQuery = reactive({ page: 1, pageSize: 50, keyword: '' })</w:t>
-        <w:br/>
-      </w:r>
-      <w:r>
-        <w:rPr>
-          <w:rFonts w:ascii="Consolas" w:hAnsi="Consolas" w:eastAsia="Consolas"/>
-          <w:sz w:val="18"/>
-        </w:rPr>
-        <w:t>diagnostics = ref(null)</w:t>
-        <w:br/>
-      </w:r>
-      <w:r>
-        <w:rPr>
-          <w:rFonts w:ascii="Consolas" w:hAnsi="Consolas" w:eastAsia="Consolas"/>
-          <w:sz w:val="18"/>
-        </w:rPr>
-        <w:t>traces = ref([])</w:t>
+          <w:rFonts w:ascii="Consolas" w:hAnsi="Consolas" w:eastAsia="Consolas"/>
+          <w:sz w:val="18"/>
+        </w:rPr>
+        <w:t>web/src/views/DashboardView.vue</w:t>
+      </w:r>
+      <w:r>
+        <w:rPr>
+          <w:rFonts w:ascii="宋体" w:hAnsi="宋体" w:eastAsia="宋体"/>
+          <w:sz w:val="21"/>
+        </w:rPr>
+        <w:t xml:space="preserve"> 是系统总览页，进入页面时调用 </w:t>
+      </w:r>
+      <w:r>
+        <w:rPr>
+          <w:rFonts w:ascii="Consolas" w:hAnsi="Consolas" w:eastAsia="Consolas"/>
+          <w:sz w:val="18"/>
+        </w:rPr>
+        <w:t>getSystemStatus()</w:t>
+      </w:r>
+      <w:r>
+        <w:rPr>
+          <w:rFonts w:ascii="宋体" w:hAnsi="宋体" w:eastAsia="宋体"/>
+          <w:sz w:val="21"/>
+        </w:rPr>
+        <w:t xml:space="preserve"> 和其他接口加载数据。它用于展示系统概览，让老师先看到项目整体不是单页面。</w:t>
+      </w:r>
+    </w:p>
+    <w:p>
+      <w:pPr>
+        <w:pStyle w:val="Heading2"/>
+      </w:pPr>
+      <w:r>
+        <w:t>ShowcaseView</w:t>
       </w:r>
     </w:p>
     <w:p>
@@ -14907,47 +14959,115 @@
       </w:pPr>
       <w:r>
         <w:rPr>
-          <w:rFonts w:ascii="宋体" w:hAnsi="宋体" w:eastAsia="宋体"/>
-          <w:sz w:val="21"/>
-        </w:rPr>
-        <w:t>接口包括：</w:t>
-      </w:r>
-    </w:p>
-    <w:p>
-      <w:pPr>
-        <w:spacing w:before="80" w:after="120"/>
-        <w:shd w:fill="F3F6FA"/>
-      </w:pPr>
-      <w:r>
-        <w:rPr>
-          <w:rFonts w:ascii="Consolas" w:hAnsi="Consolas" w:eastAsia="Consolas"/>
-          <w:sz w:val="18"/>
-        </w:rPr>
-        <w:t>GET /ai-call-logs</w:t>
-        <w:br/>
-      </w:r>
-      <w:r>
-        <w:rPr>
-          <w:rFonts w:ascii="Consolas" w:hAnsi="Consolas" w:eastAsia="Consolas"/>
-          <w:sz w:val="18"/>
-        </w:rPr>
-        <w:t>GET /retrieval-logs</w:t>
-        <w:br/>
-      </w:r>
-      <w:r>
-        <w:rPr>
-          <w:rFonts w:ascii="Consolas" w:hAnsi="Consolas" w:eastAsia="Consolas"/>
-          <w:sz w:val="18"/>
-        </w:rPr>
-        <w:t>GET /log-diagnostics</w:t>
-        <w:br/>
-      </w:r>
-      <w:r>
-        <w:rPr>
-          <w:rFonts w:ascii="Consolas" w:hAnsi="Consolas" w:eastAsia="Consolas"/>
-          <w:sz w:val="18"/>
-        </w:rPr>
-        <w:t>GET /chat-sessions/{id}/process-traces</w:t>
+          <w:rFonts w:ascii="Consolas" w:hAnsi="Consolas" w:eastAsia="Consolas"/>
+          <w:sz w:val="18"/>
+        </w:rPr>
+        <w:t>web/src/views/ShowcaseView.vue</w:t>
+      </w:r>
+      <w:r>
+        <w:rPr>
+          <w:rFonts w:ascii="宋体" w:hAnsi="宋体" w:eastAsia="宋体"/>
+          <w:sz w:val="21"/>
+        </w:rPr>
+        <w:t xml:space="preserve"> 是答辩展示中心，页面加载时调用 </w:t>
+      </w:r>
+      <w:r>
+        <w:rPr>
+          <w:rFonts w:ascii="Consolas" w:hAnsi="Consolas" w:eastAsia="Consolas"/>
+          <w:sz w:val="18"/>
+        </w:rPr>
+        <w:t>getSystemStatus()</w:t>
+      </w:r>
+      <w:r>
+        <w:rPr>
+          <w:rFonts w:ascii="宋体" w:hAnsi="宋体" w:eastAsia="宋体"/>
+          <w:sz w:val="21"/>
+        </w:rPr>
+        <w:t>。它把核心演示路径集中起来，例如：</w:t>
+      </w:r>
+    </w:p>
+    <w:p>
+      <w:pPr>
+        <w:pStyle w:val="ListBullet"/>
+      </w:pPr>
+      <w:r>
+        <w:rPr>
+          <w:rFonts w:ascii="宋体" w:hAnsi="宋体" w:eastAsia="宋体"/>
+          <w:sz w:val="21"/>
+        </w:rPr>
+        <w:t>顾客售后中心</w:t>
+      </w:r>
+    </w:p>
+    <w:p>
+      <w:pPr>
+        <w:pStyle w:val="ListBullet"/>
+      </w:pPr>
+      <w:r>
+        <w:rPr>
+          <w:rFonts w:ascii="宋体" w:hAnsi="宋体" w:eastAsia="宋体"/>
+          <w:sz w:val="21"/>
+        </w:rPr>
+        <w:t>管理员售后审核</w:t>
+      </w:r>
+    </w:p>
+    <w:p>
+      <w:pPr>
+        <w:pStyle w:val="ListBullet"/>
+      </w:pPr>
+      <w:r>
+        <w:rPr>
+          <w:rFonts w:ascii="宋体" w:hAnsi="宋体" w:eastAsia="宋体"/>
+          <w:sz w:val="21"/>
+        </w:rPr>
+        <w:t>聊天工作台</w:t>
+      </w:r>
+    </w:p>
+    <w:p>
+      <w:pPr>
+        <w:pStyle w:val="ListBullet"/>
+      </w:pPr>
+      <w:r>
+        <w:rPr>
+          <w:rFonts w:ascii="宋体" w:hAnsi="宋体" w:eastAsia="宋体"/>
+          <w:sz w:val="21"/>
+        </w:rPr>
+        <w:t>知识库</w:t>
+      </w:r>
+    </w:p>
+    <w:p>
+      <w:pPr>
+        <w:pStyle w:val="ListBullet"/>
+      </w:pPr>
+      <w:r>
+        <w:rPr>
+          <w:rFonts w:ascii="宋体" w:hAnsi="宋体" w:eastAsia="宋体"/>
+          <w:sz w:val="21"/>
+        </w:rPr>
+        <w:t>工单中心</w:t>
+      </w:r>
+    </w:p>
+    <w:p>
+      <w:pPr>
+        <w:pStyle w:val="ListBullet"/>
+      </w:pPr>
+      <w:r>
+        <w:rPr>
+          <w:rFonts w:ascii="宋体" w:hAnsi="宋体" w:eastAsia="宋体"/>
+          <w:sz w:val="21"/>
+        </w:rPr>
+        <w:t>日志中心</w:t>
+      </w:r>
+    </w:p>
+    <w:p>
+      <w:pPr>
+        <w:pStyle w:val="ListBullet"/>
+      </w:pPr>
+      <w:r>
+        <w:rPr>
+          <w:rFonts w:ascii="宋体" w:hAnsi="宋体" w:eastAsia="宋体"/>
+          <w:sz w:val="21"/>
+        </w:rPr>
+        <w:t>AI 测试页</w:t>
       </w:r>
     </w:p>
     <w:p>
@@ -14957,141 +15077,24 @@
       </w:pPr>
       <w:r>
         <w:rPr>
-          <w:rFonts w:ascii="Consolas" w:hAnsi="Consolas" w:eastAsia="Consolas"/>
-          <w:sz w:val="18"/>
-        </w:rPr>
-        <w:t>LogServiceImpl.pageAiLogs</w:t>
-      </w:r>
-      <w:r>
-        <w:rPr>
-          <w:rFonts w:ascii="宋体" w:hAnsi="宋体" w:eastAsia="宋体"/>
-          <w:sz w:val="21"/>
-        </w:rPr>
-        <w:t xml:space="preserve"> 和 </w:t>
-      </w:r>
-      <w:r>
-        <w:rPr>
-          <w:rFonts w:ascii="Consolas" w:hAnsi="Consolas" w:eastAsia="Consolas"/>
-          <w:sz w:val="18"/>
-        </w:rPr>
-        <w:t>pageRetrievalLogs</w:t>
-      </w:r>
-      <w:r>
-        <w:rPr>
-          <w:rFonts w:ascii="宋体" w:hAnsi="宋体" w:eastAsia="宋体"/>
-          <w:sz w:val="21"/>
-        </w:rPr>
-        <w:t xml:space="preserve"> 都用 PageHelper 分页。</w:t>
-      </w:r>
-      <w:r>
-        <w:rPr>
-          <w:rFonts w:ascii="Consolas" w:hAnsi="Consolas" w:eastAsia="Consolas"/>
-          <w:sz w:val="18"/>
-        </w:rPr>
-        <w:t>getDiagnostics</w:t>
-      </w:r>
-      <w:r>
-        <w:rPr>
-          <w:rFonts w:ascii="宋体" w:hAnsi="宋体" w:eastAsia="宋体"/>
-          <w:sz w:val="21"/>
-        </w:rPr>
-        <w:t xml:space="preserve"> 会取最近 AI 日志、知识检索日志和处理轨迹，计算：</w:t>
-      </w:r>
-    </w:p>
-    <w:p>
-      <w:pPr>
-        <w:pStyle w:val="ListBullet"/>
-      </w:pPr>
-      <w:r>
-        <w:rPr>
-          <w:rFonts w:ascii="宋体" w:hAnsi="宋体" w:eastAsia="宋体"/>
-          <w:sz w:val="21"/>
-        </w:rPr>
-        <w:t>AI 成功数、失败数、跳过数。</w:t>
-      </w:r>
-    </w:p>
-    <w:p>
-      <w:pPr>
-        <w:pStyle w:val="ListBullet"/>
-      </w:pPr>
-      <w:r>
-        <w:rPr>
-          <w:rFonts w:ascii="宋体" w:hAnsi="宋体" w:eastAsia="宋体"/>
-          <w:sz w:val="21"/>
-        </w:rPr>
-        <w:t>token 数和平均耗时。</w:t>
-      </w:r>
-    </w:p>
-    <w:p>
-      <w:pPr>
-        <w:pStyle w:val="ListBullet"/>
-      </w:pPr>
-      <w:r>
-        <w:rPr>
-          <w:rFonts w:ascii="宋体" w:hAnsi="宋体" w:eastAsia="宋体"/>
-          <w:sz w:val="21"/>
-        </w:rPr>
-        <w:t>最近成功率趋势。</w:t>
-      </w:r>
-    </w:p>
-    <w:p>
-      <w:pPr>
-        <w:pStyle w:val="ListBullet"/>
-      </w:pPr>
-      <w:r>
-        <w:rPr>
-          <w:rFonts w:ascii="宋体" w:hAnsi="宋体" w:eastAsia="宋体"/>
-          <w:sz w:val="21"/>
-        </w:rPr>
-        <w:t>主要模型。</w:t>
-      </w:r>
-    </w:p>
-    <w:p>
-      <w:pPr>
-        <w:pStyle w:val="ListBullet"/>
-      </w:pPr>
-      <w:r>
-        <w:rPr>
-          <w:rFonts w:ascii="宋体" w:hAnsi="宋体" w:eastAsia="宋体"/>
-          <w:sz w:val="21"/>
-        </w:rPr>
-        <w:t>失败入口。</w:t>
-      </w:r>
-    </w:p>
-    <w:p>
-      <w:pPr>
-        <w:pStyle w:val="ListBullet"/>
-      </w:pPr>
-      <w:r>
-        <w:rPr>
-          <w:rFonts w:ascii="宋体" w:hAnsi="宋体" w:eastAsia="宋体"/>
-          <w:sz w:val="21"/>
-        </w:rPr>
-        <w:t>知识命中文档数和 Top 文档。</w:t>
-      </w:r>
-    </w:p>
-    <w:p>
-      <w:pPr>
-        <w:pStyle w:val="ListBullet"/>
-      </w:pPr>
-      <w:r>
-        <w:rPr>
-          <w:rFonts w:ascii="宋体" w:hAnsi="宋体" w:eastAsia="宋体"/>
-          <w:sz w:val="21"/>
-        </w:rPr>
-        <w:t>最新会话处理轨迹进度。</w:t>
-      </w:r>
-    </w:p>
-    <w:p>
-      <w:pPr>
-        <w:pStyle w:val="ListBullet"/>
-      </w:pPr>
-      <w:r>
-        <w:rPr>
-          <w:rFonts w:ascii="宋体" w:hAnsi="宋体" w:eastAsia="宋体"/>
-          <w:sz w:val="21"/>
-        </w:rPr>
-        <w:t>风险信号和建议动作。</w:t>
+          <w:rFonts w:ascii="宋体" w:hAnsi="宋体" w:eastAsia="宋体"/>
+          <w:sz w:val="21"/>
+        </w:rPr>
+        <w:t xml:space="preserve">当前项目里，原先两个独立展示模块已经不再作为单独页面保留，相关入口统一回到 </w:t>
+      </w:r>
+      <w:r>
+        <w:rPr>
+          <w:rFonts w:ascii="Consolas" w:hAnsi="Consolas" w:eastAsia="Consolas"/>
+          <w:sz w:val="18"/>
+        </w:rPr>
+        <w:t>/showcase</w:t>
+      </w:r>
+      <w:r>
+        <w:rPr>
+          <w:rFonts w:ascii="宋体" w:hAnsi="宋体" w:eastAsia="宋体"/>
+          <w:sz w:val="21"/>
+        </w:rPr>
+        <w:t>。所以答辩时不要再说有额外独立的运营展示接口链路，只需要说这些亮点已经合并到答辩展示页，用展示页统一说明系统闭环。</w:t>
       </w:r>
     </w:p>
     <w:p>
@@ -15113,49 +15116,21 @@
           <w:rFonts w:ascii="宋体" w:hAnsi="宋体" w:eastAsia="宋体"/>
           <w:sz w:val="21"/>
         </w:rPr>
-        <w:t xml:space="preserve">日志中心是为了证明 AI 和 RAG 链路可追踪。聊天每次生成回复时，后端都会写 </w:t>
-      </w:r>
-      <w:r>
-        <w:rPr>
-          <w:rFonts w:ascii="Consolas" w:hAnsi="Consolas" w:eastAsia="Consolas"/>
-          <w:sz w:val="18"/>
-        </w:rPr>
-        <w:t>ai_call_log</w:t>
-      </w:r>
-      <w:r>
-        <w:rPr>
-          <w:rFonts w:ascii="宋体" w:hAnsi="宋体" w:eastAsia="宋体"/>
-          <w:sz w:val="21"/>
-        </w:rPr>
-        <w:t>、</w:t>
-      </w:r>
-      <w:r>
-        <w:rPr>
-          <w:rFonts w:ascii="Consolas" w:hAnsi="Consolas" w:eastAsia="Consolas"/>
-          <w:sz w:val="18"/>
-        </w:rPr>
-        <w:t>retrieval_log</w:t>
-      </w:r>
-      <w:r>
-        <w:rPr>
-          <w:rFonts w:ascii="宋体" w:hAnsi="宋体" w:eastAsia="宋体"/>
-          <w:sz w:val="21"/>
-        </w:rPr>
-        <w:t xml:space="preserve"> 和 </w:t>
-      </w:r>
-      <w:r>
-        <w:rPr>
-          <w:rFonts w:ascii="Consolas" w:hAnsi="Consolas" w:eastAsia="Consolas"/>
-          <w:sz w:val="18"/>
-        </w:rPr>
-        <w:t>process_trace</w:t>
-      </w:r>
-      <w:r>
-        <w:rPr>
-          <w:rFonts w:ascii="宋体" w:hAnsi="宋体" w:eastAsia="宋体"/>
-          <w:sz w:val="21"/>
-        </w:rPr>
-        <w:t>。日志页面分别请求 AI 调用日志、知识命中日志和诊断接口。Service 会根据最近日志统计成功率、失败数、平均耗时、知识命中文档和轨迹进度。这样老师如果问 AI 有没有真的调用、知识库有没有命中，我可以直接打开日志中心给他看证据。</w:t>
+        <w:t xml:space="preserve">系统总览和答辩展示页不是业务主流程本身，而是为了演示完整项目。总览页让老师先看系统状态，展示页把核心功能入口和亮点说明放在一起。答辩时我可以先从展示页说明整体，再点进顾客端、管理员端、聊天、知识库、工单、日志和 AI 测试等页面逐个演示。原来单独的展示类模块已经合并到 </w:t>
+      </w:r>
+      <w:r>
+        <w:rPr>
+          <w:rFonts w:ascii="Consolas" w:hAnsi="Consolas" w:eastAsia="Consolas"/>
+          <w:sz w:val="18"/>
+        </w:rPr>
+        <w:t>/showcase</w:t>
+      </w:r>
+      <w:r>
+        <w:rPr>
+          <w:rFonts w:ascii="宋体" w:hAnsi="宋体" w:eastAsia="宋体"/>
+          <w:sz w:val="21"/>
+        </w:rPr>
+        <w:t>，所以我不会再把它们当成独立业务模块介绍。</w:t>
       </w:r>
     </w:p>
     <w:p>
@@ -15163,644 +15138,7 @@
         <w:pStyle w:val="Heading1"/>
       </w:pPr>
       <w:r>
-        <w:t>14. AI 测试页和模型状态</w:t>
-      </w:r>
-    </w:p>
-    <w:p>
-      <w:pPr>
-        <w:pStyle w:val="Heading2"/>
-      </w:pPr>
-      <w:r>
-        <w:t>源码位置</w:t>
-      </w:r>
-    </w:p>
-    <w:p>
-      <w:pPr>
-        <w:pStyle w:val="ListBullet"/>
-      </w:pPr>
-      <w:r>
-        <w:rPr>
-          <w:rFonts w:ascii="宋体" w:hAnsi="宋体" w:eastAsia="宋体"/>
-          <w:sz w:val="21"/>
-        </w:rPr>
-        <w:t>前端页面：</w:t>
-      </w:r>
-      <w:r>
-        <w:rPr>
-          <w:rFonts w:ascii="Consolas" w:hAnsi="Consolas" w:eastAsia="Consolas"/>
-          <w:sz w:val="18"/>
-        </w:rPr>
-        <w:t>web/src/views/AiTestView.vue</w:t>
-      </w:r>
-    </w:p>
-    <w:p>
-      <w:pPr>
-        <w:pStyle w:val="ListBullet"/>
-      </w:pPr>
-      <w:r>
-        <w:rPr>
-          <w:rFonts w:ascii="宋体" w:hAnsi="宋体" w:eastAsia="宋体"/>
-          <w:sz w:val="21"/>
-        </w:rPr>
-        <w:t>前端 API：</w:t>
-      </w:r>
-      <w:r>
-        <w:rPr>
-          <w:rFonts w:ascii="Consolas" w:hAnsi="Consolas" w:eastAsia="Consolas"/>
-          <w:sz w:val="18"/>
-        </w:rPr>
-        <w:t>web/src/api/aiApi.js</w:t>
-      </w:r>
-      <w:r>
-        <w:rPr>
-          <w:rFonts w:ascii="宋体" w:hAnsi="宋体" w:eastAsia="宋体"/>
-          <w:sz w:val="21"/>
-        </w:rPr>
-        <w:t>、</w:t>
-      </w:r>
-      <w:r>
-        <w:rPr>
-          <w:rFonts w:ascii="Consolas" w:hAnsi="Consolas" w:eastAsia="Consolas"/>
-          <w:sz w:val="18"/>
-        </w:rPr>
-        <w:t>web/src/api/systemApi.js</w:t>
-      </w:r>
-    </w:p>
-    <w:p>
-      <w:pPr>
-        <w:pStyle w:val="ListBullet"/>
-      </w:pPr>
-      <w:r>
-        <w:rPr>
-          <w:rFonts w:ascii="宋体" w:hAnsi="宋体" w:eastAsia="宋体"/>
-          <w:sz w:val="21"/>
-        </w:rPr>
-        <w:t>后端 Controller：</w:t>
-      </w:r>
-      <w:r>
-        <w:rPr>
-          <w:rFonts w:ascii="Consolas" w:hAnsi="Consolas" w:eastAsia="Consolas"/>
-          <w:sz w:val="18"/>
-        </w:rPr>
-        <w:t>AiTestController</w:t>
-      </w:r>
-      <w:r>
-        <w:rPr>
-          <w:rFonts w:ascii="宋体" w:hAnsi="宋体" w:eastAsia="宋体"/>
-          <w:sz w:val="21"/>
-        </w:rPr>
-        <w:t>、</w:t>
-      </w:r>
-      <w:r>
-        <w:rPr>
-          <w:rFonts w:ascii="Consolas" w:hAnsi="Consolas" w:eastAsia="Consolas"/>
-          <w:sz w:val="18"/>
-        </w:rPr>
-        <w:t>SystemController</w:t>
-      </w:r>
-    </w:p>
-    <w:p>
-      <w:pPr>
-        <w:pStyle w:val="ListBullet"/>
-      </w:pPr>
-      <w:r>
-        <w:rPr>
-          <w:rFonts w:ascii="宋体" w:hAnsi="宋体" w:eastAsia="宋体"/>
-          <w:sz w:val="21"/>
-        </w:rPr>
-        <w:t>后端 Service：</w:t>
-      </w:r>
-      <w:r>
-        <w:rPr>
-          <w:rFonts w:ascii="Consolas" w:hAnsi="Consolas" w:eastAsia="Consolas"/>
-          <w:sz w:val="18"/>
-        </w:rPr>
-        <w:t>AiServiceImpl</w:t>
-      </w:r>
-    </w:p>
-    <w:p>
-      <w:pPr>
-        <w:pStyle w:val="ListBullet"/>
-      </w:pPr>
-      <w:r>
-        <w:rPr>
-          <w:rFonts w:ascii="宋体" w:hAnsi="宋体" w:eastAsia="宋体"/>
-          <w:sz w:val="21"/>
-        </w:rPr>
-        <w:t>数据库表：</w:t>
-      </w:r>
-      <w:r>
-        <w:rPr>
-          <w:rFonts w:ascii="Consolas" w:hAnsi="Consolas" w:eastAsia="Consolas"/>
-          <w:sz w:val="18"/>
-        </w:rPr>
-        <w:t>ai_call_log</w:t>
-      </w:r>
-    </w:p>
-    <w:p>
-      <w:pPr>
-        <w:pStyle w:val="Heading2"/>
-      </w:pPr>
-      <w:r>
-        <w:t>链路说明</w:t>
-      </w:r>
-    </w:p>
-    <w:p>
-      <w:pPr>
-        <w:spacing w:line="300" w:lineRule="auto"/>
-        <w:ind w:firstLine="420"/>
-      </w:pPr>
-      <w:r>
-        <w:rPr>
-          <w:rFonts w:ascii="宋体" w:hAnsi="宋体" w:eastAsia="宋体"/>
-          <w:sz w:val="21"/>
-        </w:rPr>
-        <w:t>AI 测试页有一个 prompt 输入框：</w:t>
-      </w:r>
-    </w:p>
-    <w:p>
-      <w:pPr>
-        <w:spacing w:before="80" w:after="120"/>
-        <w:shd w:fill="F3F6FA"/>
-      </w:pPr>
-      <w:r>
-        <w:rPr>
-          <w:rFonts w:ascii="Consolas" w:hAnsi="Consolas" w:eastAsia="Consolas"/>
-          <w:sz w:val="18"/>
-        </w:rPr>
-        <w:t>prompt = ref('请回复：后端已经通过 sub2api 调用真实模型。')</w:t>
-        <w:br/>
-      </w:r>
-      <w:r>
-        <w:rPr>
-          <w:rFonts w:ascii="Consolas" w:hAnsi="Consolas" w:eastAsia="Consolas"/>
-          <w:sz w:val="18"/>
-        </w:rPr>
-        <w:t>result = ref(null)</w:t>
-        <w:br/>
-      </w:r>
-      <w:r>
-        <w:rPr>
-          <w:rFonts w:ascii="Consolas" w:hAnsi="Consolas" w:eastAsia="Consolas"/>
-          <w:sz w:val="18"/>
-        </w:rPr>
-        <w:t>loading = ref(false)</w:t>
-      </w:r>
-    </w:p>
-    <w:p>
-      <w:pPr>
-        <w:spacing w:line="300" w:lineRule="auto"/>
-        <w:ind w:firstLine="420"/>
-      </w:pPr>
-      <w:r>
-        <w:rPr>
-          <w:rFonts w:ascii="宋体" w:hAnsi="宋体" w:eastAsia="宋体"/>
-          <w:sz w:val="21"/>
-        </w:rPr>
-        <w:t>点击测试调用：</w:t>
-      </w:r>
-    </w:p>
-    <w:p>
-      <w:pPr>
-        <w:spacing w:before="80" w:after="120"/>
-        <w:shd w:fill="F3F6FA"/>
-      </w:pPr>
-      <w:r>
-        <w:rPr>
-          <w:rFonts w:ascii="Consolas" w:hAnsi="Consolas" w:eastAsia="Consolas"/>
-          <w:sz w:val="18"/>
-        </w:rPr>
-        <w:t>POST /ai-tests</w:t>
-      </w:r>
-    </w:p>
-    <w:p>
-      <w:pPr>
-        <w:spacing w:line="300" w:lineRule="auto"/>
-        <w:ind w:firstLine="420"/>
-      </w:pPr>
-      <w:r>
-        <w:rPr>
-          <w:rFonts w:ascii="宋体" w:hAnsi="宋体" w:eastAsia="宋体"/>
-          <w:sz w:val="21"/>
-        </w:rPr>
-        <w:t xml:space="preserve">后端 </w:t>
-      </w:r>
-      <w:r>
-        <w:rPr>
-          <w:rFonts w:ascii="Consolas" w:hAnsi="Consolas" w:eastAsia="Consolas"/>
-          <w:sz w:val="18"/>
-        </w:rPr>
-        <w:t>AiTestController.test</w:t>
-      </w:r>
-      <w:r>
-        <w:rPr>
-          <w:rFonts w:ascii="宋体" w:hAnsi="宋体" w:eastAsia="宋体"/>
-          <w:sz w:val="21"/>
-        </w:rPr>
-        <w:t xml:space="preserve"> 调用 </w:t>
-      </w:r>
-      <w:r>
-        <w:rPr>
-          <w:rFonts w:ascii="Consolas" w:hAnsi="Consolas" w:eastAsia="Consolas"/>
-          <w:sz w:val="18"/>
-        </w:rPr>
-        <w:t>aiService.test(prompt)</w:t>
-      </w:r>
-      <w:r>
-        <w:rPr>
-          <w:rFonts w:ascii="宋体" w:hAnsi="宋体" w:eastAsia="宋体"/>
-          <w:sz w:val="21"/>
-        </w:rPr>
-        <w:t>。</w:t>
-      </w:r>
-      <w:r>
-        <w:rPr>
-          <w:rFonts w:ascii="Consolas" w:hAnsi="Consolas" w:eastAsia="Consolas"/>
-          <w:sz w:val="18"/>
-        </w:rPr>
-        <w:t>AiServiceImpl</w:t>
-      </w:r>
-      <w:r>
-        <w:rPr>
-          <w:rFonts w:ascii="宋体" w:hAnsi="宋体" w:eastAsia="宋体"/>
-          <w:sz w:val="21"/>
-        </w:rPr>
-        <w:t xml:space="preserve"> 负责根据配置调用模型。如果 AI 没启用或调用失败，Service 会返回失败状态或兜底信息，而不是让系统崩掉。</w:t>
-      </w:r>
-    </w:p>
-    <w:p>
-      <w:pPr>
-        <w:spacing w:line="300" w:lineRule="auto"/>
-        <w:ind w:firstLine="420"/>
-      </w:pPr>
-      <w:r>
-        <w:rPr>
-          <w:rFonts w:ascii="宋体" w:hAnsi="宋体" w:eastAsia="宋体"/>
-          <w:sz w:val="21"/>
-        </w:rPr>
-        <w:t xml:space="preserve">系统模型状态相关接口在 </w:t>
-      </w:r>
-      <w:r>
-        <w:rPr>
-          <w:rFonts w:ascii="Consolas" w:hAnsi="Consolas" w:eastAsia="Consolas"/>
-          <w:sz w:val="18"/>
-        </w:rPr>
-        <w:t>SystemController</w:t>
-      </w:r>
-      <w:r>
-        <w:rPr>
-          <w:rFonts w:ascii="宋体" w:hAnsi="宋体" w:eastAsia="宋体"/>
-          <w:sz w:val="21"/>
-        </w:rPr>
-        <w:t>：</w:t>
-      </w:r>
-    </w:p>
-    <w:p>
-      <w:pPr>
-        <w:spacing w:before="80" w:after="120"/>
-        <w:shd w:fill="F3F6FA"/>
-      </w:pPr>
-      <w:r>
-        <w:rPr>
-          <w:rFonts w:ascii="Consolas" w:hAnsi="Consolas" w:eastAsia="Consolas"/>
-          <w:sz w:val="18"/>
-        </w:rPr>
-        <w:t>GET /system/status</w:t>
-        <w:br/>
-      </w:r>
-      <w:r>
-        <w:rPr>
-          <w:rFonts w:ascii="Consolas" w:hAnsi="Consolas" w:eastAsia="Consolas"/>
-          <w:sz w:val="18"/>
-        </w:rPr>
-        <w:t>GET /system/ai-models</w:t>
-        <w:br/>
-      </w:r>
-      <w:r>
-        <w:rPr>
-          <w:rFonts w:ascii="Consolas" w:hAnsi="Consolas" w:eastAsia="Consolas"/>
-          <w:sz w:val="18"/>
-        </w:rPr>
-        <w:t>PUT /system/ai-models/current</w:t>
-        <w:br/>
-      </w:r>
-      <w:r>
-        <w:rPr>
-          <w:rFonts w:ascii="Consolas" w:hAnsi="Consolas" w:eastAsia="Consolas"/>
-          <w:sz w:val="18"/>
-        </w:rPr>
-        <w:t>GET /system/enums</w:t>
-      </w:r>
-    </w:p>
-    <w:p>
-      <w:pPr>
-        <w:spacing w:line="300" w:lineRule="auto"/>
-        <w:ind w:firstLine="420"/>
-      </w:pPr>
-      <w:r>
-        <w:rPr>
-          <w:rFonts w:ascii="宋体" w:hAnsi="宋体" w:eastAsia="宋体"/>
-          <w:sz w:val="21"/>
-        </w:rPr>
-        <w:t xml:space="preserve">前端聊天页也可以切换当前模型，调用 </w:t>
-      </w:r>
-      <w:r>
-        <w:rPr>
-          <w:rFonts w:ascii="Consolas" w:hAnsi="Consolas" w:eastAsia="Consolas"/>
-          <w:sz w:val="18"/>
-        </w:rPr>
-        <w:t>switchAiModel(modelName)</w:t>
-      </w:r>
-      <w:r>
-        <w:rPr>
-          <w:rFonts w:ascii="宋体" w:hAnsi="宋体" w:eastAsia="宋体"/>
-          <w:sz w:val="21"/>
-        </w:rPr>
-        <w:t>。</w:t>
-      </w:r>
-    </w:p>
-    <w:p>
-      <w:pPr>
-        <w:pStyle w:val="Heading2"/>
-      </w:pPr>
-      <w:r>
-        <w:t>我可以这样回答老师</w:t>
-      </w:r>
-    </w:p>
-    <w:p>
-      <w:pPr>
-        <w:spacing w:before="80" w:after="120"/>
-        <w:ind w:left="340"/>
-        <w:shd w:fill="FFF7E6"/>
-      </w:pPr>
-      <w:r>
-        <w:rPr>
-          <w:rFonts w:ascii="宋体" w:hAnsi="宋体" w:eastAsia="宋体"/>
-          <w:sz w:val="21"/>
-        </w:rPr>
-        <w:t xml:space="preserve">AI 测试页是为了单独验证模型链路。前端把 prompt 发到 </w:t>
-      </w:r>
-      <w:r>
-        <w:rPr>
-          <w:rFonts w:ascii="Consolas" w:hAnsi="Consolas" w:eastAsia="Consolas"/>
-          <w:sz w:val="18"/>
-        </w:rPr>
-        <w:t>/ai-tests</w:t>
-      </w:r>
-      <w:r>
-        <w:rPr>
-          <w:rFonts w:ascii="宋体" w:hAnsi="宋体" w:eastAsia="宋体"/>
-          <w:sz w:val="21"/>
-        </w:rPr>
-        <w:t xml:space="preserve">，后端 </w:t>
-      </w:r>
-      <w:r>
-        <w:rPr>
-          <w:rFonts w:ascii="Consolas" w:hAnsi="Consolas" w:eastAsia="Consolas"/>
-          <w:sz w:val="18"/>
-        </w:rPr>
-        <w:t>AiTestController</w:t>
-      </w:r>
-      <w:r>
-        <w:rPr>
-          <w:rFonts w:ascii="宋体" w:hAnsi="宋体" w:eastAsia="宋体"/>
-          <w:sz w:val="21"/>
-        </w:rPr>
-        <w:t xml:space="preserve"> 调 </w:t>
-      </w:r>
-      <w:r>
-        <w:rPr>
-          <w:rFonts w:ascii="Consolas" w:hAnsi="Consolas" w:eastAsia="Consolas"/>
-          <w:sz w:val="18"/>
-        </w:rPr>
-        <w:t>AiServiceImpl.test</w:t>
-      </w:r>
-      <w:r>
-        <w:rPr>
-          <w:rFonts w:ascii="宋体" w:hAnsi="宋体" w:eastAsia="宋体"/>
-          <w:sz w:val="21"/>
-        </w:rPr>
-        <w:t xml:space="preserve">。这个 Service 会返回模型提供方、模型名、状态、耗时和错误信息。即使 AI 失败，业务系统也不会崩，因为聊天和回复草稿都有本地模板兜底。模型列表和切换走 </w:t>
-      </w:r>
-      <w:r>
-        <w:rPr>
-          <w:rFonts w:ascii="Consolas" w:hAnsi="Consolas" w:eastAsia="Consolas"/>
-          <w:sz w:val="18"/>
-        </w:rPr>
-        <w:t>/system/ai-models</w:t>
-      </w:r>
-      <w:r>
-        <w:rPr>
-          <w:rFonts w:ascii="宋体" w:hAnsi="宋体" w:eastAsia="宋体"/>
-          <w:sz w:val="21"/>
-        </w:rPr>
-        <w:t>，所以模型状态也能在页面上看到。</w:t>
-      </w:r>
-    </w:p>
-    <w:p>
-      <w:pPr>
-        <w:pStyle w:val="Heading1"/>
-      </w:pPr>
-      <w:r>
-        <w:t>15. 系统总览和答辩展示页</w:t>
-      </w:r>
-    </w:p>
-    <w:p>
-      <w:pPr>
-        <w:pStyle w:val="Heading2"/>
-      </w:pPr>
-      <w:r>
-        <w:t>DashboardView</w:t>
-      </w:r>
-    </w:p>
-    <w:p>
-      <w:pPr>
-        <w:spacing w:line="300" w:lineRule="auto"/>
-        <w:ind w:firstLine="420"/>
-      </w:pPr>
-      <w:r>
-        <w:rPr>
-          <w:rFonts w:ascii="Consolas" w:hAnsi="Consolas" w:eastAsia="Consolas"/>
-          <w:sz w:val="18"/>
-        </w:rPr>
-        <w:t>web/src/views/DashboardView.vue</w:t>
-      </w:r>
-      <w:r>
-        <w:rPr>
-          <w:rFonts w:ascii="宋体" w:hAnsi="宋体" w:eastAsia="宋体"/>
-          <w:sz w:val="21"/>
-        </w:rPr>
-        <w:t xml:space="preserve"> 是系统总览页，进入页面时调用 </w:t>
-      </w:r>
-      <w:r>
-        <w:rPr>
-          <w:rFonts w:ascii="Consolas" w:hAnsi="Consolas" w:eastAsia="Consolas"/>
-          <w:sz w:val="18"/>
-        </w:rPr>
-        <w:t>getSystemStatus()</w:t>
-      </w:r>
-      <w:r>
-        <w:rPr>
-          <w:rFonts w:ascii="宋体" w:hAnsi="宋体" w:eastAsia="宋体"/>
-          <w:sz w:val="21"/>
-        </w:rPr>
-        <w:t xml:space="preserve"> 和其他接口加载数据。它用于展示系统概览，让老师先看到项目整体不是单页面。</w:t>
-      </w:r>
-    </w:p>
-    <w:p>
-      <w:pPr>
-        <w:pStyle w:val="Heading2"/>
-      </w:pPr>
-      <w:r>
-        <w:t>ShowcaseView</w:t>
-      </w:r>
-    </w:p>
-    <w:p>
-      <w:pPr>
-        <w:spacing w:line="300" w:lineRule="auto"/>
-        <w:ind w:firstLine="420"/>
-      </w:pPr>
-      <w:r>
-        <w:rPr>
-          <w:rFonts w:ascii="Consolas" w:hAnsi="Consolas" w:eastAsia="Consolas"/>
-          <w:sz w:val="18"/>
-        </w:rPr>
-        <w:t>web/src/views/ShowcaseView.vue</w:t>
-      </w:r>
-      <w:r>
-        <w:rPr>
-          <w:rFonts w:ascii="宋体" w:hAnsi="宋体" w:eastAsia="宋体"/>
-          <w:sz w:val="21"/>
-        </w:rPr>
-        <w:t xml:space="preserve"> 是答辩展示中心，页面加载时调用 </w:t>
-      </w:r>
-      <w:r>
-        <w:rPr>
-          <w:rFonts w:ascii="Consolas" w:hAnsi="Consolas" w:eastAsia="Consolas"/>
-          <w:sz w:val="18"/>
-        </w:rPr>
-        <w:t>getSystemStatus()</w:t>
-      </w:r>
-      <w:r>
-        <w:rPr>
-          <w:rFonts w:ascii="宋体" w:hAnsi="宋体" w:eastAsia="宋体"/>
-          <w:sz w:val="21"/>
-        </w:rPr>
-        <w:t>。它把核心演示路径集中起来，例如：</w:t>
-      </w:r>
-    </w:p>
-    <w:p>
-      <w:pPr>
-        <w:pStyle w:val="ListBullet"/>
-      </w:pPr>
-      <w:r>
-        <w:rPr>
-          <w:rFonts w:ascii="宋体" w:hAnsi="宋体" w:eastAsia="宋体"/>
-          <w:sz w:val="21"/>
-        </w:rPr>
-        <w:t>顾客售后中心</w:t>
-      </w:r>
-    </w:p>
-    <w:p>
-      <w:pPr>
-        <w:pStyle w:val="ListBullet"/>
-      </w:pPr>
-      <w:r>
-        <w:rPr>
-          <w:rFonts w:ascii="宋体" w:hAnsi="宋体" w:eastAsia="宋体"/>
-          <w:sz w:val="21"/>
-        </w:rPr>
-        <w:t>管理员售后审核</w:t>
-      </w:r>
-    </w:p>
-    <w:p>
-      <w:pPr>
-        <w:pStyle w:val="ListBullet"/>
-      </w:pPr>
-      <w:r>
-        <w:rPr>
-          <w:rFonts w:ascii="宋体" w:hAnsi="宋体" w:eastAsia="宋体"/>
-          <w:sz w:val="21"/>
-        </w:rPr>
-        <w:t>聊天工作台</w:t>
-      </w:r>
-    </w:p>
-    <w:p>
-      <w:pPr>
-        <w:pStyle w:val="ListBullet"/>
-      </w:pPr>
-      <w:r>
-        <w:rPr>
-          <w:rFonts w:ascii="宋体" w:hAnsi="宋体" w:eastAsia="宋体"/>
-          <w:sz w:val="21"/>
-        </w:rPr>
-        <w:t>知识库</w:t>
-      </w:r>
-    </w:p>
-    <w:p>
-      <w:pPr>
-        <w:pStyle w:val="ListBullet"/>
-      </w:pPr>
-      <w:r>
-        <w:rPr>
-          <w:rFonts w:ascii="宋体" w:hAnsi="宋体" w:eastAsia="宋体"/>
-          <w:sz w:val="21"/>
-        </w:rPr>
-        <w:t>工单中心</w:t>
-      </w:r>
-    </w:p>
-    <w:p>
-      <w:pPr>
-        <w:pStyle w:val="ListBullet"/>
-      </w:pPr>
-      <w:r>
-        <w:rPr>
-          <w:rFonts w:ascii="宋体" w:hAnsi="宋体" w:eastAsia="宋体"/>
-          <w:sz w:val="21"/>
-        </w:rPr>
-        <w:t>日志中心</w:t>
-      </w:r>
-    </w:p>
-    <w:p>
-      <w:pPr>
-        <w:pStyle w:val="ListBullet"/>
-      </w:pPr>
-      <w:r>
-        <w:rPr>
-          <w:rFonts w:ascii="宋体" w:hAnsi="宋体" w:eastAsia="宋体"/>
-          <w:sz w:val="21"/>
-        </w:rPr>
-        <w:t>运营指挥中心</w:t>
-      </w:r>
-    </w:p>
-    <w:p>
-      <w:pPr>
-        <w:pStyle w:val="Heading2"/>
-      </w:pPr>
-      <w:r>
-        <w:t>我可以这样回答老师</w:t>
-      </w:r>
-    </w:p>
-    <w:p>
-      <w:pPr>
-        <w:spacing w:before="80" w:after="120"/>
-        <w:ind w:left="340"/>
-        <w:shd w:fill="FFF7E6"/>
-      </w:pPr>
-      <w:r>
-        <w:rPr>
-          <w:rFonts w:ascii="宋体" w:hAnsi="宋体" w:eastAsia="宋体"/>
-          <w:sz w:val="21"/>
-        </w:rPr>
-        <w:t>系统总览和答辩展示页不是业务主流程本身，而是为了演示完整项目。总览页让老师先看系统状态，展示页把核心功能入口放在一起。答辩时我可以先从展示页说明整体，再点进顾客端、管理员端、聊天、知识库、日志等页面逐个演示。</w:t>
-      </w:r>
-    </w:p>
-    <w:p>
-      <w:pPr>
-        <w:pStyle w:val="Heading1"/>
-      </w:pPr>
-      <w:r>
-        <w:t>16. 后端分层结构怎么讲</w:t>
+        <w:t>14. 后端分层结构怎么讲</w:t>
       </w:r>
     </w:p>
     <w:p>
@@ -16250,7 +15588,7 @@
       <w:tr>
         <w:tc>
           <w:tcPr>
-            <w:tcW w:type="dxa" w:w="4536"/>
+            <w:tcW w:type="dxa" w:w="5100"/>
             <w:shd w:fill="D9EAF7"/>
           </w:tcPr>
           <w:p>
@@ -16271,7 +15609,7 @@
         </w:tc>
         <w:tc>
           <w:tcPr>
-            <w:tcW w:type="dxa" w:w="4536"/>
+            <w:tcW w:type="dxa" w:w="5100"/>
             <w:shd w:fill="D9EAF7"/>
           </w:tcPr>
           <w:p>
@@ -16294,7 +15632,7 @@
       <w:tr>
         <w:tc>
           <w:tcPr>
-            <w:tcW w:type="dxa" w:w="4536"/>
+            <w:tcW w:type="dxa" w:w="5100"/>
           </w:tcPr>
           <w:p>
             <w:r/>
@@ -16309,7 +15647,7 @@
         </w:tc>
         <w:tc>
           <w:tcPr>
-            <w:tcW w:type="dxa" w:w="4536"/>
+            <w:tcW w:type="dxa" w:w="5100"/>
           </w:tcPr>
           <w:p>
             <w:r/>
@@ -16326,7 +15664,7 @@
       <w:tr>
         <w:tc>
           <w:tcPr>
-            <w:tcW w:type="dxa" w:w="4536"/>
+            <w:tcW w:type="dxa" w:w="5100"/>
           </w:tcPr>
           <w:p>
             <w:r/>
@@ -16341,7 +15679,7 @@
         </w:tc>
         <w:tc>
           <w:tcPr>
-            <w:tcW w:type="dxa" w:w="4536"/>
+            <w:tcW w:type="dxa" w:w="5100"/>
           </w:tcPr>
           <w:p>
             <w:r/>
@@ -16358,7 +15696,7 @@
       <w:tr>
         <w:tc>
           <w:tcPr>
-            <w:tcW w:type="dxa" w:w="4536"/>
+            <w:tcW w:type="dxa" w:w="5100"/>
           </w:tcPr>
           <w:p>
             <w:r/>
@@ -16373,7 +15711,7 @@
         </w:tc>
         <w:tc>
           <w:tcPr>
-            <w:tcW w:type="dxa" w:w="4536"/>
+            <w:tcW w:type="dxa" w:w="5100"/>
           </w:tcPr>
           <w:p>
             <w:r/>
@@ -16432,7 +15770,7 @@
       <w:tr>
         <w:tc>
           <w:tcPr>
-            <w:tcW w:type="dxa" w:w="4536"/>
+            <w:tcW w:type="dxa" w:w="5100"/>
           </w:tcPr>
           <w:p>
             <w:r/>
@@ -16447,7 +15785,7 @@
         </w:tc>
         <w:tc>
           <w:tcPr>
-            <w:tcW w:type="dxa" w:w="4536"/>
+            <w:tcW w:type="dxa" w:w="5100"/>
           </w:tcPr>
           <w:p>
             <w:r/>
@@ -16534,7 +15872,7 @@
       <w:tr>
         <w:tc>
           <w:tcPr>
-            <w:tcW w:type="dxa" w:w="4536"/>
+            <w:tcW w:type="dxa" w:w="5100"/>
           </w:tcPr>
           <w:p>
             <w:r/>
@@ -16549,7 +15887,7 @@
         </w:tc>
         <w:tc>
           <w:tcPr>
-            <w:tcW w:type="dxa" w:w="4536"/>
+            <w:tcW w:type="dxa" w:w="5100"/>
           </w:tcPr>
           <w:p>
             <w:r/>
@@ -16580,7 +15918,7 @@
       <w:tr>
         <w:tc>
           <w:tcPr>
-            <w:tcW w:type="dxa" w:w="4536"/>
+            <w:tcW w:type="dxa" w:w="5100"/>
           </w:tcPr>
           <w:p>
             <w:r/>
@@ -16595,7 +15933,7 @@
         </w:tc>
         <w:tc>
           <w:tcPr>
-            <w:tcW w:type="dxa" w:w="4536"/>
+            <w:tcW w:type="dxa" w:w="5100"/>
           </w:tcPr>
           <w:p>
             <w:r/>
@@ -16630,7 +15968,7 @@
         <w:pStyle w:val="Heading1"/>
       </w:pPr>
       <w:r>
-        <w:t>17. 一条完整例子：顾客申请售后</w:t>
+        <w:t>15. 一条完整例子：顾客申请售后</w:t>
       </w:r>
     </w:p>
     <w:p>
@@ -17468,7 +16806,7 @@
         <w:pStyle w:val="Heading1"/>
       </w:pPr>
       <w:r>
-        <w:t>18. 老师可能追问的问题</w:t>
+        <w:t>16. 老师可能追问的问题</w:t>
       </w:r>
     </w:p>
     <w:p>

</xml_diff>